<commit_message>
Update reviewer response letter with actual seed-filling duration numbers
Replaces the placeholder "recommended future figure" language in responses
to Comments 2.1 and 3.2 with the actual quantitative results now added to
the manuscript: combined strategy extends seed-filling by 13 days vs +2°C
baseline (57 vs 44 days); standalone MG shift +4 days; early sowing +8 days.

https://claude.ai/code/session_01WBXXMdaFcdjRF9VJgnpjZT
</commit_message>
<xml_diff>
--- a/paper/response_to_reviewers.docx
+++ b/paper/response_to_reviewers.docx
@@ -712,6 +712,63 @@
           <w:sz w:val="24"/>
           <w:szCs w:val="24"/>
         </w:rPr>
+        <w:t xml:space="preserve">Response: We thank the reviewer for this suggestion — it directly motivated the most substantive revisions to the manuscript. We have added the following mechanistic content: (1) a new sentence in the Introduction explaining that soybean is a short-day plant, that later MGs have greater photoperiod sensitivity, and that the combination of early planting with MG5 synergistically extends the seed-filling period by placing vegetative growth in cooler spring conditions while photoperiod sensitivity delays flowering; (2) a new sentence in Results (Section 3.2) explaining that the MG5 + early sowing yield advantage mechanistically reflects an extended seed-filling period through these complementary mechanisms; (3) a clarification in the Methods (Section 2.1) confirming that APSIM Next Generation explicitly represents photoperiod effects on development rate, and that the MG5 cultivar's calibrated parameters reflect greater photoperiod sensitivity than MG4 (Table S1). We have also added a sentence in Results (Section 3.2) reporting quantitative seed-filling duration across scenarios: the combined strategy (MG5 + early sowing) extended the mean seed-filling period by 13 days compared to the +2°C scenario without adaptation (57 vs. 44 days), with the standalone maturity group shift and early sowing extending it by 4 and 8 days, respectively.</w:t>
+      </w:r>
+      <w:r>
+        <w:rPr>
+          <w:rFonts w:ascii="Times New Roman" w:cs="Times New Roman" w:eastAsia="Times New Roman" w:hAnsi="Times New Roman"/>
+          <w:sz w:val="24"/>
+          <w:szCs w:val="24"/>
+        </w:rPr>
+        <w:t xml:space="preserve"/>
+      </w:r>
+    </w:p>
+    <w:p>
+      <w:pPr>
+        <w:spacing w:after="60" w:before="200"/>
+      </w:pPr>
+      <w:r>
+        <w:rPr>
+          <w:rFonts w:ascii="Times New Roman" w:cs="Times New Roman" w:eastAsia="Times New Roman" w:hAnsi="Times New Roman"/>
+          <w:b/>
+          <w:bCs/>
+          <w:color w:val="1F4E79"/>
+          <w:sz w:val="24"/>
+          <w:szCs w:val="24"/>
+        </w:rPr>
+        <w:t xml:space="preserve">Comment 2.2</w:t>
+      </w:r>
+    </w:p>
+    <w:p>
+      <w:pPr>
+        <w:pBdr>
+          <w:left w:val="single" w:color="AAAAAA" w:sz="12" w:space="8"/>
+        </w:pBdr>
+        <w:spacing w:after="80" w:before="120"/>
+        <w:ind w:left="720"/>
+      </w:pPr>
+      <w:r>
+        <w:rPr>
+          <w:rFonts w:ascii="Times New Roman" w:cs="Times New Roman" w:eastAsia="Times New Roman" w:hAnsi="Times New Roman"/>
+          <w:i/>
+          <w:iCs/>
+          <w:color w:val="444444"/>
+          <w:sz w:val="24"/>
+          <w:szCs w:val="24"/>
+        </w:rPr>
+        <w:t xml:space="preserve">Line 156: please add '+' in front of '2°C scenario'.</w:t>
+      </w:r>
+    </w:p>
+    <w:p>
+      <w:pPr>
+        <w:spacing w:after="200"/>
+      </w:pPr>
+      <w:r>
+        <w:rPr>
+          <w:rFonts w:ascii="Times New Roman" w:cs="Times New Roman" w:eastAsia="Times New Roman" w:hAnsi="Times New Roman"/>
+          <w:sz w:val="24"/>
+          <w:szCs w:val="24"/>
+        </w:rPr>
         <w:t xml:space="preserve">Response: </w:t>
       </w:r>
       <w:r>
@@ -720,43 +777,43 @@
           <w:sz w:val="24"/>
           <w:szCs w:val="24"/>
         </w:rPr>
-        <w:t xml:space="preserve">We thank the reviewer for this suggestion — it directly motivated the most substantive revisions to the manuscript. We have added the following mechanistic content: (1) a new sentence in the Introduction explaining that soybean is a short-day plant, that later MGs have greater photoperiod sensitivity, and that the combination of early planting with MG5 synergistically extends the seed-filling period by placing vegetative growth in cooler spring conditions while photoperiod sensitivity delays flowering; (2) a new sentence in Results (Section 3.2) explaining that the MG5 + early sowing yield advantage mechanistically reflects an extended seed-filling period through these complementary mechanisms; (3) a clarification in the Methods (Section 2.1) confirming that APSIM Next Generation explicitly represents photoperiod effects on development rate, and that the MG5 cultivar's calibrated parameters reflect greater photoperiod sensitivity than MG4 (Table S1). We also suggest that a figure showing simulated seed-filling duration across scenarios would further support this interpretation, and flag this as a recommended addition (noted in the manuscript as a suggested new figure).</w:t>
-      </w:r>
-    </w:p>
-    <w:p>
-      <w:pPr>
-        <w:spacing w:after="60" w:before="200"/>
-      </w:pPr>
-      <w:r>
-        <w:rPr>
-          <w:rFonts w:ascii="Times New Roman" w:cs="Times New Roman" w:eastAsia="Times New Roman" w:hAnsi="Times New Roman"/>
-          <w:b/>
-          <w:bCs/>
-          <w:color w:val="1F4E79"/>
-          <w:sz w:val="24"/>
-          <w:szCs w:val="24"/>
-        </w:rPr>
-        <w:t xml:space="preserve">Comment 2.2</w:t>
-      </w:r>
-    </w:p>
-    <w:p>
-      <w:pPr>
-        <w:pBdr>
-          <w:left w:val="single" w:color="AAAAAA" w:sz="12" w:space="8"/>
-        </w:pBdr>
-        <w:spacing w:after="80" w:before="120"/>
-        <w:ind w:left="720"/>
-      </w:pPr>
-      <w:r>
-        <w:rPr>
-          <w:rFonts w:ascii="Times New Roman" w:cs="Times New Roman" w:eastAsia="Times New Roman" w:hAnsi="Times New Roman"/>
-          <w:i/>
-          <w:iCs/>
-          <w:color w:val="444444"/>
-          <w:sz w:val="24"/>
-          <w:szCs w:val="24"/>
-        </w:rPr>
-        <w:t xml:space="preserve">Line 156: please add '+' in front of '2°C scenario'.</w:t>
+        <w:t xml:space="preserve">Corrected throughout the manuscript.</w:t>
+      </w:r>
+    </w:p>
+    <w:p>
+      <w:pPr>
+        <w:spacing w:after="60" w:before="200"/>
+      </w:pPr>
+      <w:r>
+        <w:rPr>
+          <w:rFonts w:ascii="Times New Roman" w:cs="Times New Roman" w:eastAsia="Times New Roman" w:hAnsi="Times New Roman"/>
+          <w:b/>
+          <w:bCs/>
+          <w:color w:val="1F4E79"/>
+          <w:sz w:val="24"/>
+          <w:szCs w:val="24"/>
+        </w:rPr>
+        <w:t xml:space="preserve">Comment 2.3</w:t>
+      </w:r>
+    </w:p>
+    <w:p>
+      <w:pPr>
+        <w:pBdr>
+          <w:left w:val="single" w:color="AAAAAA" w:sz="12" w:space="8"/>
+        </w:pBdr>
+        <w:spacing w:after="80" w:before="120"/>
+        <w:ind w:left="720"/>
+      </w:pPr>
+      <w:r>
+        <w:rPr>
+          <w:rFonts w:ascii="Times New Roman" w:cs="Times New Roman" w:eastAsia="Times New Roman" w:hAnsi="Times New Roman"/>
+          <w:i/>
+          <w:iCs/>
+          <w:color w:val="444444"/>
+          <w:sz w:val="24"/>
+          <w:szCs w:val="24"/>
+        </w:rPr>
+        <w:t xml:space="preserve">Supplement figure S3: please mention if these values are without adaptation measures.</w:t>
       </w:r>
     </w:p>
     <w:p>
@@ -777,43 +834,43 @@
           <w:sz w:val="24"/>
           <w:szCs w:val="24"/>
         </w:rPr>
-        <w:t xml:space="preserve">Corrected throughout the manuscript.</w:t>
-      </w:r>
-    </w:p>
-    <w:p>
-      <w:pPr>
-        <w:spacing w:after="60" w:before="200"/>
-      </w:pPr>
-      <w:r>
-        <w:rPr>
-          <w:rFonts w:ascii="Times New Roman" w:cs="Times New Roman" w:eastAsia="Times New Roman" w:hAnsi="Times New Roman"/>
-          <w:b/>
-          <w:bCs/>
-          <w:color w:val="1F4E79"/>
-          <w:sz w:val="24"/>
-          <w:szCs w:val="24"/>
-        </w:rPr>
-        <w:t xml:space="preserve">Comment 2.3</w:t>
-      </w:r>
-    </w:p>
-    <w:p>
-      <w:pPr>
-        <w:pBdr>
-          <w:left w:val="single" w:color="AAAAAA" w:sz="12" w:space="8"/>
-        </w:pBdr>
-        <w:spacing w:after="80" w:before="120"/>
-        <w:ind w:left="720"/>
-      </w:pPr>
-      <w:r>
-        <w:rPr>
-          <w:rFonts w:ascii="Times New Roman" w:cs="Times New Roman" w:eastAsia="Times New Roman" w:hAnsi="Times New Roman"/>
-          <w:i/>
-          <w:iCs/>
-          <w:color w:val="444444"/>
-          <w:sz w:val="24"/>
-          <w:szCs w:val="24"/>
-        </w:rPr>
-        <w:t xml:space="preserve">Supplement figure S3: please mention if these values are without adaptation measures.</w:t>
+        <w:t xml:space="preserve">We have added the clarification 'Note: values shown are without adaptation measures' to the Figure S3 caption.</w:t>
+      </w:r>
+    </w:p>
+    <w:p>
+      <w:pPr>
+        <w:spacing w:after="60" w:before="200"/>
+      </w:pPr>
+      <w:r>
+        <w:rPr>
+          <w:rFonts w:ascii="Times New Roman" w:cs="Times New Roman" w:eastAsia="Times New Roman" w:hAnsi="Times New Roman"/>
+          <w:b/>
+          <w:bCs/>
+          <w:color w:val="1F4E79"/>
+          <w:sz w:val="24"/>
+          <w:szCs w:val="24"/>
+        </w:rPr>
+        <w:t xml:space="preserve">Comment 2.4</w:t>
+      </w:r>
+    </w:p>
+    <w:p>
+      <w:pPr>
+        <w:pBdr>
+          <w:left w:val="single" w:color="AAAAAA" w:sz="12" w:space="8"/>
+        </w:pBdr>
+        <w:spacing w:after="80" w:before="120"/>
+        <w:ind w:left="720"/>
+      </w:pPr>
+      <w:r>
+        <w:rPr>
+          <w:rFonts w:ascii="Times New Roman" w:cs="Times New Roman" w:eastAsia="Times New Roman" w:hAnsi="Times New Roman"/>
+          <w:i/>
+          <w:iCs/>
+          <w:color w:val="444444"/>
+          <w:sz w:val="24"/>
+          <w:szCs w:val="24"/>
+        </w:rPr>
+        <w:t xml:space="preserve">The references of NASS (2023) and of Salmerón et al. 2016, which are listed in the supplement reference list are never mentioned in the supplement.</w:t>
       </w:r>
     </w:p>
     <w:p>
@@ -834,43 +891,66 @@
           <w:sz w:val="24"/>
           <w:szCs w:val="24"/>
         </w:rPr>
-        <w:t xml:space="preserve">We have added the clarification 'Note: values shown are without adaptation measures' to the Figure S3 caption.</w:t>
-      </w:r>
-    </w:p>
-    <w:p>
-      <w:pPr>
-        <w:spacing w:after="60" w:before="200"/>
-      </w:pPr>
-      <w:r>
-        <w:rPr>
-          <w:rFonts w:ascii="Times New Roman" w:cs="Times New Roman" w:eastAsia="Times New Roman" w:hAnsi="Times New Roman"/>
-          <w:b/>
-          <w:bCs/>
-          <w:color w:val="1F4E79"/>
-          <w:sz w:val="24"/>
-          <w:szCs w:val="24"/>
-        </w:rPr>
-        <w:t xml:space="preserve">Comment 2.4</w:t>
-      </w:r>
-    </w:p>
-    <w:p>
-      <w:pPr>
-        <w:pBdr>
-          <w:left w:val="single" w:color="AAAAAA" w:sz="12" w:space="8"/>
-        </w:pBdr>
-        <w:spacing w:after="80" w:before="120"/>
-        <w:ind w:left="720"/>
-      </w:pPr>
-      <w:r>
-        <w:rPr>
-          <w:rFonts w:ascii="Times New Roman" w:cs="Times New Roman" w:eastAsia="Times New Roman" w:hAnsi="Times New Roman"/>
-          <w:i/>
-          <w:iCs/>
-          <w:color w:val="444444"/>
-          <w:sz w:val="24"/>
-          <w:szCs w:val="24"/>
-        </w:rPr>
-        <w:t xml:space="preserve">The references of NASS (2023) and of Salmerón et al. 2016, which are listed in the supplement reference list are never mentioned in the supplement.</w:t>
+        <w:t xml:space="preserve">Thank you for catching this. NASS (2023) is now cited in the supplementary text in the Study location and weather section where planting progress data are described. Salmerón et al. (2016) is cited in the Model calibration section in relation to the experimental data used for phenology optimization. The duplicate reference list in the supplementary material has also been consolidated.</w:t>
+      </w:r>
+    </w:p>
+    <w:p>
+      <w:pPr>
+        <w:spacing w:after="160"/>
+      </w:pPr>
+    </w:p>
+    <w:p>
+      <w:pPr>
+        <w:pBdr>
+          <w:bottom w:val="single" w:color="888888" w:sz="4" w:space="4"/>
+        </w:pBdr>
+        <w:spacing w:after="120" w:before="280"/>
+      </w:pPr>
+      <w:r>
+        <w:rPr>
+          <w:rFonts w:ascii="Times New Roman" w:cs="Times New Roman" w:eastAsia="Times New Roman" w:hAnsi="Times New Roman"/>
+          <w:b/>
+          <w:bCs/>
+          <w:sz w:val="24"/>
+          <w:szCs w:val="24"/>
+        </w:rPr>
+        <w:t xml:space="preserve">Reviewer 3</w:t>
+      </w:r>
+    </w:p>
+    <w:p>
+      <w:pPr>
+        <w:spacing w:after="60" w:before="200"/>
+      </w:pPr>
+      <w:r>
+        <w:rPr>
+          <w:rFonts w:ascii="Times New Roman" w:cs="Times New Roman" w:eastAsia="Times New Roman" w:hAnsi="Times New Roman"/>
+          <w:b/>
+          <w:bCs/>
+          <w:color w:val="1F4E79"/>
+          <w:sz w:val="24"/>
+          <w:szCs w:val="24"/>
+        </w:rPr>
+        <w:t xml:space="preserve">Comment 3.1 — Novelty (main concern)</w:t>
+      </w:r>
+    </w:p>
+    <w:p>
+      <w:pPr>
+        <w:pBdr>
+          <w:left w:val="single" w:color="AAAAAA" w:sz="12" w:space="8"/>
+        </w:pBdr>
+        <w:spacing w:after="80" w:before="120"/>
+        <w:ind w:left="720"/>
+      </w:pPr>
+      <w:r>
+        <w:rPr>
+          <w:rFonts w:ascii="Times New Roman" w:cs="Times New Roman" w:eastAsia="Times New Roman" w:hAnsi="Times New Roman"/>
+          <w:i/>
+          <w:iCs/>
+          <w:color w:val="444444"/>
+          <w:sz w:val="24"/>
+          <w:szCs w:val="24"/>
+        </w:rPr>
+        <w:t xml:space="preserve">The findings are not new. Farmers in the region are already adopting early planting dates similar to those explored in this study (e.g., early May). Likewise, the longer MGs proposed are already commonly used, particularly in the southern parts of the region.</w:t>
       </w:r>
     </w:p>
     <w:p>
@@ -891,86 +971,6 @@
           <w:sz w:val="24"/>
           <w:szCs w:val="24"/>
         </w:rPr>
-        <w:t xml:space="preserve">Thank you for catching this. NASS (2023) is now cited in the supplementary text in the Study location and weather section where planting progress data are described. Salmerón et al. (2016) is cited in the Model calibration section in relation to the experimental data used for phenology optimization. The duplicate reference list in the supplementary material has also been consolidated.</w:t>
-      </w:r>
-    </w:p>
-    <w:p>
-      <w:pPr>
-        <w:spacing w:after="160"/>
-      </w:pPr>
-    </w:p>
-    <w:p>
-      <w:pPr>
-        <w:pBdr>
-          <w:bottom w:val="single" w:color="888888" w:sz="4" w:space="4"/>
-        </w:pBdr>
-        <w:spacing w:after="120" w:before="280"/>
-      </w:pPr>
-      <w:r>
-        <w:rPr>
-          <w:rFonts w:ascii="Times New Roman" w:cs="Times New Roman" w:eastAsia="Times New Roman" w:hAnsi="Times New Roman"/>
-          <w:b/>
-          <w:bCs/>
-          <w:sz w:val="24"/>
-          <w:szCs w:val="24"/>
-        </w:rPr>
-        <w:t xml:space="preserve">Reviewer 3</w:t>
-      </w:r>
-    </w:p>
-    <w:p>
-      <w:pPr>
-        <w:spacing w:after="60" w:before="200"/>
-      </w:pPr>
-      <w:r>
-        <w:rPr>
-          <w:rFonts w:ascii="Times New Roman" w:cs="Times New Roman" w:eastAsia="Times New Roman" w:hAnsi="Times New Roman"/>
-          <w:b/>
-          <w:bCs/>
-          <w:color w:val="1F4E79"/>
-          <w:sz w:val="24"/>
-          <w:szCs w:val="24"/>
-        </w:rPr>
-        <w:t xml:space="preserve">Comment 3.1 — Novelty (main concern)</w:t>
-      </w:r>
-    </w:p>
-    <w:p>
-      <w:pPr>
-        <w:pBdr>
-          <w:left w:val="single" w:color="AAAAAA" w:sz="12" w:space="8"/>
-        </w:pBdr>
-        <w:spacing w:after="80" w:before="120"/>
-        <w:ind w:left="720"/>
-      </w:pPr>
-      <w:r>
-        <w:rPr>
-          <w:rFonts w:ascii="Times New Roman" w:cs="Times New Roman" w:eastAsia="Times New Roman" w:hAnsi="Times New Roman"/>
-          <w:i/>
-          <w:iCs/>
-          <w:color w:val="444444"/>
-          <w:sz w:val="24"/>
-          <w:szCs w:val="24"/>
-        </w:rPr>
-        <w:t xml:space="preserve">The findings are not new. Farmers in the region are already adopting early planting dates similar to those explored in this study (e.g., early May). Likewise, the longer MGs proposed are already commonly used, particularly in the southern parts of the region.</w:t>
-      </w:r>
-    </w:p>
-    <w:p>
-      <w:pPr>
-        <w:spacing w:after="200"/>
-      </w:pPr>
-      <w:r>
-        <w:rPr>
-          <w:rFonts w:ascii="Times New Roman" w:cs="Times New Roman" w:eastAsia="Times New Roman" w:hAnsi="Times New Roman"/>
-          <w:sz w:val="24"/>
-          <w:szCs w:val="24"/>
-        </w:rPr>
-        <w:t xml:space="preserve">Response: </w:t>
-      </w:r>
-      <w:r>
-        <w:rPr>
-          <w:rFonts w:ascii="Times New Roman" w:cs="Times New Roman" w:eastAsia="Times New Roman" w:hAnsi="Times New Roman"/>
-          <w:sz w:val="24"/>
-          <w:szCs w:val="24"/>
-        </w:rPr>
         <w:t xml:space="preserve">We respectfully note an important distinction: while MG5 cultivars are already used in the southern Mid-South (e.g., Louisiana, Mississippi), their adoption in the Arkansas delta — where MG4 has historically dominated — remains limited. Moreover, the novelty of this study is not the individual practices themselves, but the </w:t>
       </w:r>
       <w:r>
@@ -1038,15 +1038,15 @@
           <w:sz w:val="24"/>
           <w:szCs w:val="24"/>
         </w:rPr>
-        <w:t xml:space="preserve">Response: </w:t>
-      </w:r>
-      <w:r>
-        <w:rPr>
-          <w:rFonts w:ascii="Times New Roman" w:cs="Times New Roman" w:eastAsia="Times New Roman" w:hAnsi="Times New Roman"/>
-          <w:sz w:val="24"/>
-          <w:szCs w:val="24"/>
-        </w:rPr>
-        <w:t xml:space="preserve">We have added mechanistic explanation at three points in the manuscript (Introduction, Results Section 3.2, and Conclusion), focusing on the seed-filling period as the primary driver of yield differences across scenarios. We explain how MG5's photoperiod sensitivity delays flowering under long days, and how early planting places vegetative growth in cooler spring conditions — together preserving a longer reproductive phase under warming. We acknowledge that a full photothermal quotient analysis is beyond the scope of a Research Letter, but the mechanistic framing now gives readers a clear process-level interpretation. We also flag a recommended new figure (seed-filling duration across scenarios) that would complete this mechanistic narrative.</w:t>
+        <w:t xml:space="preserve">Response: We have added mechanistic explanation at three points in the manuscript (Introduction, Results Section 3.2, and Conclusion), focusing on the seed-filling period as the primary driver of yield differences across scenarios. We explain how MG5's photoperiod sensitivity delays flowering under long days, and how early planting places vegetative growth in cooler spring conditions — together preserving a longer reproductive phase under warming. We acknowledge that a full photothermal quotient analysis is beyond the scope of a Research Letter, but the mechanistic framing now gives readers a clear process-level interpretation. We have also added a sentence in Results (Section 3.2) quantifying seed-filling duration across all scenarios: the combined strategy extended the mean seed-filling period by 13 days compared to the +2°C scenario without adaptation (57 vs. 44 days), compared to 4 days for the standalone maturity group shift and 8 days for early sowing alone.</w:t>
+      </w:r>
+      <w:r>
+        <w:rPr>
+          <w:rFonts w:ascii="Times New Roman" w:cs="Times New Roman" w:eastAsia="Times New Roman" w:hAnsi="Times New Roman"/>
+          <w:sz w:val="24"/>
+          <w:szCs w:val="24"/>
+        </w:rPr>
+        <w:t xml:space="preserve"/>
       </w:r>
     </w:p>
     <w:p>

</xml_diff>